<commit_message>
SC2 Responsive Elected Leaders citizen-v2.1: reworked around the FINAL proposal grid (two proposals: independent redistricting commission, voter education/civics) — each spotlight carries the grid's reported frequency/consensus/concerns answered with record facts (three commission designs' independence mechanics verified in bill text, decennial-cycle keying vs the 2026 mid-decade redraw, the neutrality question in H3547/H4392, never-filed neutral voter tool); four superseded lanes kept as wider accountability record; config and Appendices H/I updated; record unchanged; front brief re-verified 2pp in both renders
Co-authored-by: CaptainWrechols <CaptainWrechols@users.noreply.github.com>
</commit_message>
<xml_diff>
--- a/briefs/south-carolina/responsive-elected-leaders/citizen-v2/appendices/appendices.docx
+++ b/briefs/south-carolina/responsive-elected-leaders/citizen-v2/appendices/appendices.docx
@@ -38238,13 +38238,13 @@
     </w:p>
     <w:bookmarkEnd w:id="68"/>
     <w:bookmarkEnd w:id="69"/>
-    <w:bookmarkStart w:id="76" w:name="appendix-h-proposal-crosswalk"/>
+    <w:bookmarkStart w:id="73" w:name="Xb5ad38790dac8d735e3ea343eaeacaf1a3b9db5"/>
     <w:p>
       <w:pPr>
         <w:pStyle w:val="Heading1"/>
       </w:pPr>
       <w:r>
-        <w:t xml:space="preserve">Appendix H — Proposal crosswalk</w:t>
+        <w:t xml:space="preserve">Appendix H — Citizen proposals and the record</w:t>
       </w:r>
     </w:p>
     <w:p>
@@ -38252,34 +38252,65 @@
         <w:pStyle w:val="FirstParagraph"/>
       </w:pPr>
       <w:r>
-        <w:t xml:space="preserve">The six Phase 2 constituent proposals [P-…] matched against the 2019–2026</w:t>
+        <w:t xml:space="preserve">The final Community Conversations proposal grid for this issue (</w:t>
+      </w:r>
+      <w:r>
+        <w:t xml:space="preserve">“</w:t>
+      </w:r>
+      <w:r>
+        <w:t xml:space="preserve">SC1 —</w:t>
       </w:r>
       <w:r>
         <w:t xml:space="preserve"> </w:t>
       </w:r>
       <w:r>
-        <w:t xml:space="preserve">legislative record. Proposals are Forum process input from the Community</w:t>
+        <w:t xml:space="preserve">Responsive Elected Leaders,</w:t>
+      </w:r>
+      <w:r>
+        <w:t xml:space="preserve">”</w:t>
       </w:r>
       <w:r>
         <w:t xml:space="preserve"> </w:t>
       </w:r>
       <w:r>
-        <w:t xml:space="preserve">Conversations (June–August 2026); the matches and coverage judgments come</w:t>
+        <w:t xml:space="preserve">received 2026-09-04) carries</w:t>
       </w:r>
       <w:r>
         <w:t xml:space="preserve"> </w:t>
       </w:r>
       <w:r>
-        <w:t xml:space="preserve">from the hand-reviewed curation documented in the working files.</w:t>
+        <w:rPr>
+          <w:bCs/>
+          <w:b/>
+        </w:rPr>
+        <w:t xml:space="preserve">two proposals</w:t>
       </w:r>
       <w:r>
         <w:t xml:space="preserve"> </w:t>
       </w:r>
       <w:r>
+        <w:t xml:space="preserve">forward, with the issue framed by concern that</w:t>
+      </w:r>
+      <w:r>
+        <w:t xml:space="preserve"> </w:t>
+      </w:r>
+      <w:r>
         <w:t xml:space="preserve">“</w:t>
       </w:r>
       <w:r>
-        <w:t xml:space="preserve">Matched</w:t>
+        <w:t xml:space="preserve">the state’s elected leaders</w:t>
+      </w:r>
+      <w:r>
+        <w:t xml:space="preserve"> </w:t>
+      </w:r>
+      <w:r>
+        <w:t xml:space="preserve">fail to respond to constituent priorities, whether because of unlimited</w:t>
+      </w:r>
+      <w:r>
+        <w:t xml:space="preserve"> </w:t>
+      </w:r>
+      <w:r>
+        <w:t xml:space="preserve">terms or other weak accountability mechanisms.</w:t>
       </w:r>
       <w:r>
         <w:t xml:space="preserve">”</w:t>
@@ -38288,40 +38319,72 @@
         <w:t xml:space="preserve"> </w:t>
       </w:r>
       <w:r>
-        <w:t xml:space="preserve">bills speak to the proposal directly;</w:t>
+        <w:t xml:space="preserve">This appendix matches each</w:t>
       </w:r>
       <w:r>
         <w:t xml:space="preserve"> </w:t>
       </w:r>
       <w:r>
-        <w:t xml:space="preserve">“</w:t>
-      </w:r>
-      <w:r>
-        <w:t xml:space="preserve">nearby</w:t>
-      </w:r>
-      <w:r>
-        <w:t xml:space="preserve">”</w:t>
+        <w:t xml:space="preserve">final proposal — and its reported frequency, consensus, and concerns —</w:t>
       </w:r>
       <w:r>
         <w:t xml:space="preserve"> </w:t>
       </w:r>
       <w:r>
-        <w:t xml:space="preserve">bills share the lane but</w:t>
+        <w:t xml:space="preserve">against the 2019–2026 legislative record.</w:t>
+      </w:r>
+    </w:p>
+    <w:p>
+      <w:pPr>
+        <w:pStyle w:val="BodyText"/>
+      </w:pPr>
+      <w:r>
+        <w:t xml:space="preserve">Provenance note: the earlier Phase 2 v2 grid listed six proposals for this</w:t>
       </w:r>
       <w:r>
         <w:t xml:space="preserve"> </w:t>
       </w:r>
       <w:r>
-        <w:t xml:space="preserve">differ in target or direction.</w:t>
+        <w:t xml:space="preserve">issue (adding term limits, campaign finance reform, ranked choice voting,</w:t>
+      </w:r>
+      <w:r>
+        <w:t xml:space="preserve"> </w:t>
+      </w:r>
+      <w:r>
+        <w:t xml:space="preserve">and financial disclosure). The final grid supersedes it; those four lanes</w:t>
+      </w:r>
+      <w:r>
+        <w:t xml:space="preserve"> </w:t>
+      </w:r>
+      <w:r>
+        <w:t xml:space="preserve">did not advance as proposals and now appear in this packet as the wider</w:t>
+      </w:r>
+      <w:r>
+        <w:t xml:space="preserve"> </w:t>
+      </w:r>
+      <w:r>
+        <w:t xml:space="preserve">accountability record (Appendices A–E carry their full bill-by-bill</w:t>
+      </w:r>
+      <w:r>
+        <w:t xml:space="preserve"> </w:t>
+      </w:r>
+      <w:r>
+        <w:t xml:space="preserve">detail — the record scans are unchanged). Proposal frequency, consensus,</w:t>
+      </w:r>
+      <w:r>
+        <w:t xml:space="preserve"> </w:t>
+      </w:r>
+      <w:r>
+        <w:t xml:space="preserve">and concerns are Forum process input, not verified facts.</w:t>
       </w:r>
     </w:p>
-    <w:bookmarkStart w:id="70" w:name="X62dea25e4ded753a7d0759c8fb7c1891c014f71"/>
+    <w:bookmarkStart w:id="70" w:name="X91ce4883726585e48c3949bb619df5addc83399"/>
     <w:p>
       <w:pPr>
         <w:pStyle w:val="Heading2"/>
       </w:pPr>
       <w:r>
-        <w:t xml:space="preserve">[P-term-limits] Term limits / rotation rules for elected officials</w:t>
+        <w:t xml:space="preserve">[P-independent-redistricting] Independent / nonpartisan redistricting commission (anti-gerrymandering)</w:t>
       </w:r>
     </w:p>
     <w:p>
@@ -38337,13 +38400,13 @@
           <w:bCs/>
           <w:b/>
         </w:rPr>
-        <w:t xml:space="preserve">Consensus note (process input):</w:t>
+        <w:t xml:space="preserve">Reported frequency (process input):</w:t>
       </w:r>
       <w:r>
         <w:t xml:space="preserve"> </w:t>
       </w:r>
       <w:r>
-        <w:t xml:space="preserve">very high frequency (all four events); mixed consensus — loss of experience vs. entrenched incumbency.</w:t>
+        <w:t xml:space="preserve">High — appeared in three out of four in-person events.</w:t>
       </w:r>
     </w:p>
     <w:p>
@@ -38359,13 +38422,13 @@
           <w:bCs/>
           <w:b/>
         </w:rPr>
-        <w:t xml:space="preserve">Matched:</w:t>
+        <w:t xml:space="preserve">Reported consensus (process input):</w:t>
       </w:r>
       <w:r>
         <w:t xml:space="preserve"> </w:t>
       </w:r>
       <w:r>
-        <w:t xml:space="preserve">30 state-level measures (all died in first committee, no votes) plus the adopted congressional application H3008 (2025).</w:t>
+        <w:t xml:space="preserve">High — very strong support where the idea was discussed.</w:t>
       </w:r>
     </w:p>
     <w:p>
@@ -38381,13 +38444,13 @@
           <w:bCs/>
           <w:b/>
         </w:rPr>
-        <w:t xml:space="preserve">Nearby:</w:t>
+        <w:t xml:space="preserve">Reported concerns (process input):</w:t>
       </w:r>
       <w:r>
         <w:t xml:space="preserve"> </w:t>
       </w:r>
       <w:r>
-        <w:t xml:space="preserve">the chamber-rule chairmen rotation (H4692), the U.S. Supreme Court resolution (H3102), and the broad Convention of the States applications (H3125, S112, S133, S141, H3676).</w:t>
+        <w:t xml:space="preserve">Some worried about how independent the commission would be. Others noted that keeping redistricting on the ten-year cycle would help.</w:t>
       </w:r>
     </w:p>
     <w:p>
@@ -38403,23 +38466,111 @@
           <w:bCs/>
           <w:b/>
         </w:rPr>
+        <w:t xml:space="preserve">Matched bills:</w:t>
+      </w:r>
+      <w:r>
+        <w:t xml:space="preserve"> </w:t>
+      </w:r>
+      <w:r>
+        <w:t xml:space="preserve">21 commission/criteria bills, 2019–2024 — constitutional independent commissions with referendum approval (H3044, S6, S135 in 2019; H3279, S561 in 2021; H3173 in 2023), Citizens Redistricting Commission bills (H3432, S254 in 2019; H4201, H4202 in 2021; H3243, H3245 in 2023), the Anti-Gerrymandering Act (H4222, 2023), independent-commission statutes (H3054, S230 in 2019), and the FAIR in Redistricting Act criteria bills (H4229, S750 in 2021; H3069 in 2023). All died in a Judiciary committee with no hearing and no vote.</w:t>
+      </w:r>
+    </w:p>
+    <w:p>
+      <w:pPr>
+        <w:numPr>
+          <w:ilvl w:val="0"/>
+          <w:numId w:val="1011"/>
+        </w:numPr>
+        <w:pStyle w:val="Compact"/>
+      </w:pPr>
+      <w:r>
+        <w:rPr>
+          <w:bCs/>
+          <w:b/>
+        </w:rPr>
+        <w:t xml:space="preserve">Record facts on the independence concern:</w:t>
+      </w:r>
+      <w:r>
+        <w:t xml:space="preserve"> </w:t>
+      </w:r>
+      <w:r>
+        <w:t xml:space="preserve">the filed designs answer it differently — nine members chosen by a review panel appointed by the State Inspector General with maps approved by statewide referendum; twelve members appointed by the State Ethics Commission balanced five/five/two across parties; plans protected from legislative or executive alteration or veto; or criteria-only, with the legislature keeping the pen.</w:t>
+      </w:r>
+    </w:p>
+    <w:p>
+      <w:pPr>
+        <w:numPr>
+          <w:ilvl w:val="0"/>
+          <w:numId w:val="1011"/>
+        </w:numPr>
+        <w:pStyle w:val="Compact"/>
+      </w:pPr>
+      <w:r>
+        <w:rPr>
+          <w:bCs/>
+          <w:b/>
+        </w:rPr>
+        <w:t xml:space="preserve">Record facts on the ten-year-cycle concern:</w:t>
+      </w:r>
+      <w:r>
+        <w:t xml:space="preserve"> </w:t>
+      </w:r>
+      <w:r>
+        <w:t xml:space="preserve">every filed design keys to the decennial census; the record’s one mid-decade redraw attempt (H5683, 2026) passed the House 74–37 and was shelved on the Senate floor 26–18 (motion to continue). A companion (H4717) died in committee.</w:t>
+      </w:r>
+    </w:p>
+    <w:p>
+      <w:pPr>
+        <w:numPr>
+          <w:ilvl w:val="0"/>
+          <w:numId w:val="1011"/>
+        </w:numPr>
+        <w:pStyle w:val="Compact"/>
+      </w:pPr>
+      <w:r>
+        <w:rPr>
+          <w:bCs/>
+          <w:b/>
+        </w:rPr>
+        <w:t xml:space="preserve">Nearby:</w:t>
+      </w:r>
+      <w:r>
+        <w:t xml:space="preserve"> </w:t>
+      </w:r>
+      <w:r>
+        <w:t xml:space="preserve">the legislature’s own enacted maps — H4493 (Act 117 of 2021) and S865 (Act 118 of 2022).</w:t>
+      </w:r>
+    </w:p>
+    <w:p>
+      <w:pPr>
+        <w:numPr>
+          <w:ilvl w:val="0"/>
+          <w:numId w:val="1011"/>
+        </w:numPr>
+        <w:pStyle w:val="Compact"/>
+      </w:pPr>
+      <w:r>
+        <w:rPr>
+          <w:bCs/>
+          <w:b/>
+        </w:rPr>
         <w:t xml:space="preserve">Coverage:</w:t>
       </w:r>
       <w:r>
         <w:t xml:space="preserve"> </w:t>
       </w:r>
       <w:r>
-        <w:t xml:space="preserve">substantial attempts, zero state-level movement; the federal-target route is the only one that has finished.</w:t>
+        <w:t xml:space="preserve">substantial attempts, zero movement. The constitution assigns reapportionment to the General Assembly, so the full commission design requires a constitutional amendment — two-thirds of each chamber plus a referendum. No commission bill was filed in 2025-26, the first session without one in this record.</w:t>
       </w:r>
     </w:p>
     <w:bookmarkEnd w:id="70"/>
-    <w:bookmarkStart w:id="71" w:name="Xefcdbcfe318d58730a56c5103ff5bcd1a8bc4f9"/>
+    <w:bookmarkStart w:id="71" w:name="X0a91d04eafccc630d0ae5a9061b85e2430002cf"/>
     <w:p>
       <w:pPr>
         <w:pStyle w:val="Heading2"/>
       </w:pPr>
       <w:r>
-        <w:t xml:space="preserve">[P-campaign-finance-reform] Limits on money in politics / campaign finance reform</w:t>
+        <w:t xml:space="preserve">[P-voter-civics-education] Better voter education / civics and neutral civic information tools</w:t>
       </w:r>
     </w:p>
     <w:p>
@@ -38435,13 +38586,13 @@
           <w:bCs/>
           <w:b/>
         </w:rPr>
-        <w:t xml:space="preserve">Consensus note (process input):</w:t>
+        <w:t xml:space="preserve">Reported frequency (process input):</w:t>
       </w:r>
       <w:r>
         <w:t xml:space="preserve"> </w:t>
       </w:r>
       <w:r>
-        <w:t xml:space="preserve">very high frequency; high consensus; PAC limits specifically noted; constitutional limits on regulating political spending flagged as a constraint.</w:t>
+        <w:t xml:space="preserve">Medium — appeared in Charleston and Columbia.</w:t>
       </w:r>
     </w:p>
     <w:p>
@@ -38457,13 +38608,13 @@
           <w:bCs/>
           <w:b/>
         </w:rPr>
-        <w:t xml:space="preserve">Matched:</w:t>
+        <w:t xml:space="preserve">Reported consensus (process input):</w:t>
       </w:r>
       <w:r>
         <w:t xml:space="preserve"> </w:t>
       </w:r>
       <w:r>
-        <w:t xml:space="preserve">24 bills — disclosure (dark-money ads, contributor employers, bank statements, $500+ electioneering reports), bans (corporate contributions, monopoly contributions, pay-to-play appointments), public financing (AG races), enforcement funding (interest on campaign accounts), and the dependent-care spending bill (H4561, the lane’s one floor vote, House 53–45).</w:t>
+        <w:t xml:space="preserve">High — very strong support where the idea was discussed.</w:t>
       </w:r>
     </w:p>
     <w:p>
@@ -38479,13 +38630,13 @@
           <w:bCs/>
           <w:b/>
         </w:rPr>
-        <w:t xml:space="preserve">Nearby:</w:t>
+        <w:t xml:space="preserve">Reported concern (process input):</w:t>
       </w:r>
       <w:r>
         <w:t xml:space="preserve"> </w:t>
       </w:r>
       <w:r>
-        <w:t xml:space="preserve">the five contribution-limit bills — all of which would raise limits — plus the official-funds mailing ban (S537), the Article V campaign-finance application (S192), and the deepfake-ad bans (H4660, H3517).</w:t>
+        <w:t xml:space="preserve">how neutral information would be selected and disseminated.</w:t>
       </w:r>
     </w:p>
     <w:p>
@@ -38501,30 +38652,20 @@
           <w:bCs/>
           <w:b/>
         </w:rPr>
-        <w:t xml:space="preserve">Coverage:</w:t>
+        <w:t xml:space="preserve">Matched bills:</w:t>
       </w:r>
       <w:r>
         <w:t xml:space="preserve"> </w:t>
       </w:r>
       <w:r>
-        <w:t xml:space="preserve">substantial attempts, one House passage, zero enactments. The constraint citizens flagged (federal constitutional limits on spending caps) matches the record: filed bills chase disclosure, not spending limits.</w:t>
-      </w:r>
-    </w:p>
-    <w:bookmarkEnd w:id="71"/>
-    <w:bookmarkStart w:id="72" w:name="Xea8ab0b7a3b70edea0800bbc3b182f911a8e453"/>
-    <w:p>
-      <w:pPr>
-        <w:pStyle w:val="Heading2"/>
-      </w:pPr>
-      <w:r>
-        <w:t xml:space="preserve">[P-ranked-choice-voting] Ranked choice voting</w:t>
+        <w:t xml:space="preserve">the REACH Act family — S38 (Act 26 of 2021; college-level civics instruction; 45–0 and 91–12), its 2019 predecessor S35 (passed the Senate 29–7, died in House Education and Public Works), House versions H4296 (2019) and H3338 (2021) — and the middle-school civics-unit bill H3547 (2025, unheard; the State Board of Education would adopt the curriculum).</w:t>
       </w:r>
     </w:p>
     <w:p>
       <w:pPr>
         <w:numPr>
           <w:ilvl w:val="0"/>
-          <w:numId w:val="1013"/>
+          <w:numId w:val="1012"/>
         </w:numPr>
         <w:pStyle w:val="Compact"/>
       </w:pPr>
@@ -38533,20 +38674,20 @@
           <w:bCs/>
           <w:b/>
         </w:rPr>
-        <w:t xml:space="preserve">Consensus note (process input):</w:t>
+        <w:t xml:space="preserve">Record facts on the neutrality concern:</w:t>
       </w:r>
       <w:r>
         <w:t xml:space="preserve"> </w:t>
       </w:r>
       <w:r>
-        <w:t xml:space="preserve">very high frequency; partial consensus; voter-confusion concerns raised.</w:t>
+        <w:t xml:space="preserve">the curator question exists in the record from both directions — H3547 names the State Board of Education as curriculum curator; H4392 (2022) would have limited compelled topics and barred private funding for civics curriculum. Neither received a vote. No bill proposes a neutral voter-information tool or assigns any agency to build or curate one.</w:t>
       </w:r>
     </w:p>
     <w:p>
       <w:pPr>
         <w:numPr>
           <w:ilvl w:val="0"/>
-          <w:numId w:val="1013"/>
+          <w:numId w:val="1012"/>
         </w:numPr>
         <w:pStyle w:val="Compact"/>
       </w:pPr>
@@ -38555,42 +38696,20 @@
           <w:bCs/>
           <w:b/>
         </w:rPr>
-        <w:t xml:space="preserve">Matched:</w:t>
+        <w:t xml:space="preserve">Nearby:</w:t>
       </w:r>
       <w:r>
         <w:t xml:space="preserve"> </w:t>
       </w:r>
       <w:r>
-        <w:t xml:space="preserve">three local-option enabling bills (H5135, H4022, H3589) and two statewide bans (H4591, H3386) — all died in House Judiciary without hearings.</w:t>
+        <w:t xml:space="preserve">civic-education money in the budget — a Clemson civic-engagement center study (FY 2024-25 proviso 45.11) and $2.5 million for USC’s Center for American Civic Leadership and Public Discourse (FY 2026-27, inside proviso 118.21).</w:t>
       </w:r>
     </w:p>
     <w:p>
       <w:pPr>
         <w:numPr>
           <w:ilvl w:val="0"/>
-          <w:numId w:val="1013"/>
-        </w:numPr>
-        <w:pStyle w:val="Compact"/>
-      </w:pPr>
-      <w:r>
-        <w:rPr>
-          <w:bCs/>
-          <w:b/>
-        </w:rPr>
-        <w:t xml:space="preserve">Nearby:</w:t>
-      </w:r>
-      <w:r>
-        <w:t xml:space="preserve"> </w:t>
-      </w:r>
-      <w:r>
-        <w:t xml:space="preserve">the runoff-abolition bills (H3606, H3552, H4592, H3318).</w:t>
-      </w:r>
-    </w:p>
-    <w:p>
-      <w:pPr>
-        <w:numPr>
-          <w:ilvl w:val="0"/>
-          <w:numId w:val="1013"/>
+          <w:numId w:val="1012"/>
         </w:numPr>
         <w:pStyle w:val="Compact"/>
       </w:pPr>
@@ -38605,330 +38724,17 @@
         <w:t xml:space="preserve"> </w:t>
       </w:r>
       <w:r>
-        <w:t xml:space="preserve">attempts in both directions, zero movement in either. Statewide RCV for general elections has never been filed.</w:t>
+        <w:t xml:space="preserve">thin with one enactment; the specific tool citizens described has no legislative history.</w:t>
       </w:r>
     </w:p>
-    <w:bookmarkEnd w:id="72"/>
-    <w:bookmarkStart w:id="73" w:name="X9b1374955495efd988800a58f5fbf76c4d9ec9d"/>
+    <w:bookmarkEnd w:id="71"/>
+    <w:bookmarkStart w:id="72" w:name="X77f2e4d09c604283df7596083e4afbe51532ed1"/>
     <w:p>
       <w:pPr>
         <w:pStyle w:val="Heading2"/>
       </w:pPr>
       <w:r>
-        <w:t xml:space="preserve">[P-independent-redistricting] Independent/nonpartisan redistricting commission</w:t>
-      </w:r>
-    </w:p>
-    <w:p>
-      <w:pPr>
-        <w:numPr>
-          <w:ilvl w:val="0"/>
-          <w:numId w:val="1014"/>
-        </w:numPr>
-        <w:pStyle w:val="Compact"/>
-      </w:pPr>
-      <w:r>
-        <w:rPr>
-          <w:bCs/>
-          <w:b/>
-        </w:rPr>
-        <w:t xml:space="preserve">Consensus note (process input):</w:t>
-      </w:r>
-      <w:r>
-        <w:t xml:space="preserve"> </w:t>
-      </w:r>
-      <w:r>
-        <w:t xml:space="preserve">high frequency (three events); high consensus where discussed; the debated tradeoff was who appoints the commission.</w:t>
-      </w:r>
-    </w:p>
-    <w:p>
-      <w:pPr>
-        <w:numPr>
-          <w:ilvl w:val="0"/>
-          <w:numId w:val="1014"/>
-        </w:numPr>
-        <w:pStyle w:val="Compact"/>
-      </w:pPr>
-      <w:r>
-        <w:rPr>
-          <w:bCs/>
-          <w:b/>
-        </w:rPr>
-        <w:t xml:space="preserve">Matched:</w:t>
-      </w:r>
-      <w:r>
-        <w:t xml:space="preserve"> </w:t>
-      </w:r>
-      <w:r>
-        <w:t xml:space="preserve">21 commission/criteria bills, 2019–2024 — zero hearings, zero votes. No commission bill filed in 2025-26.</w:t>
-      </w:r>
-    </w:p>
-    <w:p>
-      <w:pPr>
-        <w:numPr>
-          <w:ilvl w:val="0"/>
-          <w:numId w:val="1014"/>
-        </w:numPr>
-        <w:pStyle w:val="Compact"/>
-      </w:pPr>
-      <w:r>
-        <w:rPr>
-          <w:bCs/>
-          <w:b/>
-        </w:rPr>
-        <w:t xml:space="preserve">Nearby:</w:t>
-      </w:r>
-      <w:r>
-        <w:t xml:space="preserve"> </w:t>
-      </w:r>
-      <w:r>
-        <w:t xml:space="preserve">the legislature’s own enacted maps (H4493/Act 117, S865/Act 118) and the 2026 mid-decade redraw fight (H5683 passed the House 74–37, shelved by the Senate 26–18; H4717 died in committee).</w:t>
-      </w:r>
-    </w:p>
-    <w:p>
-      <w:pPr>
-        <w:numPr>
-          <w:ilvl w:val="0"/>
-          <w:numId w:val="1014"/>
-        </w:numPr>
-        <w:pStyle w:val="Compact"/>
-      </w:pPr>
-      <w:r>
-        <w:rPr>
-          <w:bCs/>
-          <w:b/>
-        </w:rPr>
-        <w:t xml:space="preserve">Coverage:</w:t>
-      </w:r>
-      <w:r>
-        <w:t xml:space="preserve"> </w:t>
-      </w:r>
-      <w:r>
-        <w:t xml:space="preserve">substantial attempts, zero movement. The constitution assigns reapportionment to the General Assembly, so the full commission design requires a constitutional amendment — two-thirds of each chamber plus a referendum.</w:t>
-      </w:r>
-    </w:p>
-    <w:bookmarkEnd w:id="73"/>
-    <w:bookmarkStart w:id="74" w:name="X9dbe72f97a1f6c1c332a792ef6370be3602c519"/>
-    <w:p>
-      <w:pPr>
-        <w:pStyle w:val="Heading2"/>
-      </w:pPr>
-      <w:r>
-        <w:t xml:space="preserve">[P-financial-disclosure] Better financial-disclosure and conflict-of-interest tracking (incl. PACs)</w:t>
-      </w:r>
-    </w:p>
-    <w:p>
-      <w:pPr>
-        <w:numPr>
-          <w:ilvl w:val="0"/>
-          <w:numId w:val="1015"/>
-        </w:numPr>
-        <w:pStyle w:val="Compact"/>
-      </w:pPr>
-      <w:r>
-        <w:rPr>
-          <w:bCs/>
-          <w:b/>
-        </w:rPr>
-        <w:t xml:space="preserve">Consensus note (process input):</w:t>
-      </w:r>
-      <w:r>
-        <w:t xml:space="preserve"> </w:t>
-      </w:r>
-      <w:r>
-        <w:t xml:space="preserve">high frequency; high consensus; enforcement capacity the practical question.</w:t>
-      </w:r>
-    </w:p>
-    <w:p>
-      <w:pPr>
-        <w:numPr>
-          <w:ilvl w:val="0"/>
-          <w:numId w:val="1015"/>
-        </w:numPr>
-        <w:pStyle w:val="Compact"/>
-      </w:pPr>
-      <w:r>
-        <w:rPr>
-          <w:bCs/>
-          <w:b/>
-        </w:rPr>
-        <w:t xml:space="preserve">Matched:</w:t>
-      </w:r>
-      <w:r>
-        <w:t xml:space="preserve"> </w:t>
-      </w:r>
-      <w:r>
-        <w:t xml:space="preserve">25 bills. Enacted: S70 (School Board Ethics Act, Act 191 of 2026). Nearly enacted: H3570 (disclosure rewrite; 102–0 and 40–0, died in conference; one piece became FY 2026-27 proviso 117.219). The rest — tax-return disclosure, e-filing audits, special-purpose-district coverage, ethics-fine ballot bars, party-chairmen coverage — died without votes.</w:t>
-      </w:r>
-    </w:p>
-    <w:p>
-      <w:pPr>
-        <w:numPr>
-          <w:ilvl w:val="0"/>
-          <w:numId w:val="1015"/>
-        </w:numPr>
-        <w:pStyle w:val="Compact"/>
-      </w:pPr>
-      <w:r>
-        <w:rPr>
-          <w:bCs/>
-          <w:b/>
-        </w:rPr>
-        <w:t xml:space="preserve">Nearby:</w:t>
-      </w:r>
-      <w:r>
-        <w:t xml:space="preserve"> </w:t>
-      </w:r>
-      <w:r>
-        <w:t xml:space="preserve">the reporting-process bill (S932), the filing exemption for unpaid appointees (H3321, 2025 — the one deregulatory bill), the revolving-door lobbying bills, and the leadership-sponsored local-lobbying bill (S632).</w:t>
-      </w:r>
-    </w:p>
-    <w:p>
-      <w:pPr>
-        <w:numPr>
-          <w:ilvl w:val="0"/>
-          <w:numId w:val="1015"/>
-        </w:numPr>
-        <w:pStyle w:val="Compact"/>
-      </w:pPr>
-      <w:r>
-        <w:rPr>
-          <w:bCs/>
-          <w:b/>
-        </w:rPr>
-        <w:t xml:space="preserve">Coverage:</w:t>
-      </w:r>
-      <w:r>
-        <w:t xml:space="preserve"> </w:t>
-      </w:r>
-      <w:r>
-        <w:t xml:space="preserve">one enactment, one conference death — the most movement of any proposal. The enforcement-capacity question citizens raised lives in budget provisos (110.1, 110.2) rather than statute.</w:t>
-      </w:r>
-    </w:p>
-    <w:bookmarkEnd w:id="74"/>
-    <w:bookmarkStart w:id="75" w:name="X0a91d04eafccc630d0ae5a9061b85e2430002cf"/>
-    <w:p>
-      <w:pPr>
-        <w:pStyle w:val="Heading2"/>
-      </w:pPr>
-      <w:r>
-        <w:t xml:space="preserve">[P-voter-civics-education] Better voter education / civics and neutral civic information tools</w:t>
-      </w:r>
-    </w:p>
-    <w:p>
-      <w:pPr>
-        <w:numPr>
-          <w:ilvl w:val="0"/>
-          <w:numId w:val="1016"/>
-        </w:numPr>
-        <w:pStyle w:val="Compact"/>
-      </w:pPr>
-      <w:r>
-        <w:rPr>
-          <w:bCs/>
-          <w:b/>
-        </w:rPr>
-        <w:t xml:space="preserve">Consensus note (process input):</w:t>
-      </w:r>
-      <w:r>
-        <w:t xml:space="preserve"> </w:t>
-      </w:r>
-      <w:r>
-        <w:t xml:space="preserve">medium frequency; high consensus; who curates</w:t>
-      </w:r>
-      <w:r>
-        <w:t xml:space="preserve"> </w:t>
-      </w:r>
-      <w:r>
-        <w:t xml:space="preserve">“</w:t>
-      </w:r>
-      <w:r>
-        <w:t xml:space="preserve">neutral</w:t>
-      </w:r>
-      <w:r>
-        <w:t xml:space="preserve">”</w:t>
-      </w:r>
-      <w:r>
-        <w:t xml:space="preserve"> </w:t>
-      </w:r>
-      <w:r>
-        <w:t xml:space="preserve">information was the open question.</w:t>
-      </w:r>
-    </w:p>
-    <w:p>
-      <w:pPr>
-        <w:numPr>
-          <w:ilvl w:val="0"/>
-          <w:numId w:val="1016"/>
-        </w:numPr>
-        <w:pStyle w:val="Compact"/>
-      </w:pPr>
-      <w:r>
-        <w:rPr>
-          <w:bCs/>
-          <w:b/>
-        </w:rPr>
-        <w:t xml:space="preserve">Matched:</w:t>
-      </w:r>
-      <w:r>
-        <w:t xml:space="preserve"> </w:t>
-      </w:r>
-      <w:r>
-        <w:t xml:space="preserve">the REACH Act family — S38 (Act 26 of 2021, college civics instruction, 45–0 and 91–12), its 2019 predecessor S35 (passed the Senate 29–7, died in House Education), House versions H4296 and H3338 — and the K-12 civics-unit bill H3547 (2025, unheard).</w:t>
-      </w:r>
-    </w:p>
-    <w:p>
-      <w:pPr>
-        <w:numPr>
-          <w:ilvl w:val="0"/>
-          <w:numId w:val="1016"/>
-        </w:numPr>
-        <w:pStyle w:val="Compact"/>
-      </w:pPr>
-      <w:r>
-        <w:rPr>
-          <w:bCs/>
-          <w:b/>
-        </w:rPr>
-        <w:t xml:space="preserve">Nearby:</w:t>
-      </w:r>
-      <w:r>
-        <w:t xml:space="preserve"> </w:t>
-      </w:r>
-      <w:r>
-        <w:t xml:space="preserve">the civics content-restriction bill (H4392) and the budget’s civic-education money (FY 2024-25 proviso 45.11; FY 2026-27 USC line in 118.21).</w:t>
-      </w:r>
-    </w:p>
-    <w:p>
-      <w:pPr>
-        <w:numPr>
-          <w:ilvl w:val="0"/>
-          <w:numId w:val="1016"/>
-        </w:numPr>
-        <w:pStyle w:val="Compact"/>
-      </w:pPr>
-      <w:r>
-        <w:rPr>
-          <w:bCs/>
-          <w:b/>
-        </w:rPr>
-        <w:t xml:space="preserve">Coverage:</w:t>
-      </w:r>
-      <w:r>
-        <w:t xml:space="preserve"> </w:t>
-      </w:r>
-      <w:r>
-        <w:t xml:space="preserve">thin with one enactment. No bill in this record proposes a neutral voter-information tool.</w:t>
-      </w:r>
-    </w:p>
-    <w:bookmarkEnd w:id="75"/>
-    <w:bookmarkEnd w:id="76"/>
-    <w:bookmarkStart w:id="80" w:name="appendix-i-sources-and-review-notes"/>
-    <w:p>
-      <w:pPr>
-        <w:pStyle w:val="Heading1"/>
-      </w:pPr>
-      <w:r>
-        <w:t xml:space="preserve">Appendix I — Sources and review notes</w:t>
+        <w:t xml:space="preserve">The background lanes named in the grid’s framing</w:t>
       </w:r>
     </w:p>
     <w:p>
@@ -38936,6 +38742,375 @@
         <w:pStyle w:val="FirstParagraph"/>
       </w:pPr>
       <w:r>
+        <w:t xml:space="preserve">The grid’s framing sentence names</w:t>
+      </w:r>
+      <w:r>
+        <w:t xml:space="preserve"> </w:t>
+      </w:r>
+      <w:r>
+        <w:t xml:space="preserve">“</w:t>
+      </w:r>
+      <w:r>
+        <w:t xml:space="preserve">unlimited terms or other weak</w:t>
+      </w:r>
+      <w:r>
+        <w:t xml:space="preserve"> </w:t>
+      </w:r>
+      <w:r>
+        <w:t xml:space="preserve">accountability mechanisms</w:t>
+      </w:r>
+      <w:r>
+        <w:t xml:space="preserve">”</w:t>
+      </w:r>
+      <w:r>
+        <w:t xml:space="preserve"> </w:t>
+      </w:r>
+      <w:r>
+        <w:t xml:space="preserve">as the underlying concern. For reference, the</w:t>
+      </w:r>
+      <w:r>
+        <w:t xml:space="preserve"> </w:t>
+      </w:r>
+      <w:r>
+        <w:t xml:space="preserve">record on those background lanes (full detail in Appendices A–E):</w:t>
+      </w:r>
+    </w:p>
+    <w:tbl>
+      <w:tblPr>
+        <w:tblStyle w:val="Table"/>
+        <w:tblW w:type="pct" w:w="5000"/>
+        <w:tblLook w:firstRow="1" w:lastRow="0" w:firstColumn="0" w:lastColumn="0" w:noHBand="0" w:noVBand="0" w:val="0020"/>
+        <w:jc w:val="start"/>
+      </w:tblPr>
+      <w:tblGrid>
+        <w:gridCol w:w="2640"/>
+        <w:gridCol w:w="2640"/>
+        <w:gridCol w:w="2640"/>
+      </w:tblGrid>
+      <w:tr>
+        <w:trPr>
+          <w:tblHeader w:val="true"/>
+        </w:trPr>
+        <w:tc>
+          <w:tcPr/>
+          <w:p>
+            <w:pPr>
+              <w:pStyle w:val="Compact"/>
+              <w:jc w:val="left"/>
+            </w:pPr>
+            <w:r>
+              <w:t xml:space="preserve">Lane</w:t>
+            </w:r>
+          </w:p>
+        </w:tc>
+        <w:tc>
+          <w:tcPr/>
+          <w:p>
+            <w:pPr>
+              <w:pStyle w:val="Compact"/>
+              <w:jc w:val="left"/>
+            </w:pPr>
+            <w:r>
+              <w:t xml:space="preserve">Bills</w:t>
+            </w:r>
+          </w:p>
+        </w:tc>
+        <w:tc>
+          <w:tcPr/>
+          <w:p>
+            <w:pPr>
+              <w:pStyle w:val="Compact"/>
+              <w:jc w:val="left"/>
+            </w:pPr>
+            <w:r>
+              <w:t xml:space="preserve">What moved</w:t>
+            </w:r>
+          </w:p>
+        </w:tc>
+      </w:tr>
+      <w:tr>
+        <w:tc>
+          <w:tcPr/>
+          <w:p>
+            <w:pPr>
+              <w:pStyle w:val="Compact"/>
+              <w:jc w:val="left"/>
+            </w:pPr>
+            <w:r>
+              <w:t xml:space="preserve">Term limits</w:t>
+            </w:r>
+          </w:p>
+        </w:tc>
+        <w:tc>
+          <w:tcPr/>
+          <w:p>
+            <w:pPr>
+              <w:pStyle w:val="Compact"/>
+              <w:jc w:val="left"/>
+            </w:pPr>
+            <w:r>
+              <w:t xml:space="preserve">37 (30 state-level)</w:t>
+            </w:r>
+          </w:p>
+        </w:tc>
+        <w:tc>
+          <w:tcPr/>
+          <w:p>
+            <w:pPr>
+              <w:pStyle w:val="Compact"/>
+              <w:jc w:val="left"/>
+            </w:pPr>
+            <w:r>
+              <w:t xml:space="preserve">None heard at the state level; the congressional term-limits Article V application (H3008) was adopted May 2025, Senate 29–14</w:t>
+            </w:r>
+          </w:p>
+        </w:tc>
+      </w:tr>
+      <w:tr>
+        <w:tc>
+          <w:tcPr/>
+          <w:p>
+            <w:pPr>
+              <w:pStyle w:val="Compact"/>
+              <w:jc w:val="left"/>
+            </w:pPr>
+            <w:r>
+              <w:t xml:space="preserve">Campaign money rules</w:t>
+            </w:r>
+          </w:p>
+        </w:tc>
+        <w:tc>
+          <w:tcPr/>
+          <w:p>
+            <w:pPr>
+              <w:pStyle w:val="Compact"/>
+              <w:jc w:val="left"/>
+            </w:pPr>
+            <w:r>
+              <w:t xml:space="preserve">36</w:t>
+            </w:r>
+          </w:p>
+        </w:tc>
+        <w:tc>
+          <w:tcPr/>
+          <w:p>
+            <w:pPr>
+              <w:pStyle w:val="Compact"/>
+              <w:jc w:val="left"/>
+            </w:pPr>
+            <w:r>
+              <w:t xml:space="preserve">One floor vote in eight years (H4561, House 53–45, died in Senate Judiciary)</w:t>
+            </w:r>
+          </w:p>
+        </w:tc>
+      </w:tr>
+      <w:tr>
+        <w:tc>
+          <w:tcPr/>
+          <w:p>
+            <w:pPr>
+              <w:pStyle w:val="Compact"/>
+              <w:jc w:val="left"/>
+            </w:pPr>
+            <w:r>
+              <w:t xml:space="preserve">Financial disclosure &amp; ethics enforcement</w:t>
+            </w:r>
+          </w:p>
+        </w:tc>
+        <w:tc>
+          <w:tcPr/>
+          <w:p>
+            <w:pPr>
+              <w:pStyle w:val="Compact"/>
+              <w:jc w:val="left"/>
+            </w:pPr>
+            <w:r>
+              <w:t xml:space="preserve">27</w:t>
+            </w:r>
+          </w:p>
+        </w:tc>
+        <w:tc>
+          <w:tcPr/>
+          <w:p>
+            <w:pPr>
+              <w:pStyle w:val="Compact"/>
+              <w:jc w:val="left"/>
+            </w:pPr>
+            <w:r>
+              <w:t xml:space="preserve">School Board Ethics Act enacted (S70, Act 191 of 2026); the H3570 disclosure rewrite passed 102–0 and 40–0 and died in conference; proviso 117.219 carried a slice</w:t>
+            </w:r>
+          </w:p>
+        </w:tc>
+      </w:tr>
+      <w:tr>
+        <w:tc>
+          <w:tcPr/>
+          <w:p>
+            <w:pPr>
+              <w:pStyle w:val="Compact"/>
+              <w:jc w:val="left"/>
+            </w:pPr>
+            <w:r>
+              <w:t xml:space="preserve">Lobbying rules</w:t>
+            </w:r>
+          </w:p>
+        </w:tc>
+        <w:tc>
+          <w:tcPr/>
+          <w:p>
+            <w:pPr>
+              <w:pStyle w:val="Compact"/>
+              <w:jc w:val="left"/>
+            </w:pPr>
+            <w:r>
+              <w:t xml:space="preserve">13</w:t>
+            </w:r>
+          </w:p>
+        </w:tc>
+        <w:tc>
+          <w:tcPr/>
+          <w:p>
+            <w:pPr>
+              <w:pStyle w:val="Compact"/>
+              <w:jc w:val="left"/>
+            </w:pPr>
+            <w:r>
+              <w:t xml:space="preserve">None received a vote</w:t>
+            </w:r>
+          </w:p>
+        </w:tc>
+      </w:tr>
+      <w:tr>
+        <w:tc>
+          <w:tcPr/>
+          <w:p>
+            <w:pPr>
+              <w:pStyle w:val="Compact"/>
+              <w:jc w:val="left"/>
+            </w:pPr>
+            <w:r>
+              <w:t xml:space="preserve">Open government (FOIA, meetings)</w:t>
+            </w:r>
+          </w:p>
+        </w:tc>
+        <w:tc>
+          <w:tcPr/>
+          <w:p>
+            <w:pPr>
+              <w:pStyle w:val="Compact"/>
+              <w:jc w:val="left"/>
+            </w:pPr>
+            <w:r>
+              <w:t xml:space="preserve">20</w:t>
+            </w:r>
+          </w:p>
+        </w:tc>
+        <w:tc>
+          <w:tcPr/>
+          <w:p>
+            <w:pPr>
+              <w:pStyle w:val="Compact"/>
+              <w:jc w:val="left"/>
+            </w:pPr>
+            <w:r>
+              <w:t xml:space="preserve">None received a vote</w:t>
+            </w:r>
+          </w:p>
+        </w:tc>
+      </w:tr>
+      <w:tr>
+        <w:tc>
+          <w:tcPr/>
+          <w:p>
+            <w:pPr>
+              <w:pStyle w:val="Compact"/>
+              <w:jc w:val="left"/>
+            </w:pPr>
+            <w:r>
+              <w:t xml:space="preserve">Ranked choice voting and runoffs</w:t>
+            </w:r>
+          </w:p>
+        </w:tc>
+        <w:tc>
+          <w:tcPr/>
+          <w:p>
+            <w:pPr>
+              <w:pStyle w:val="Compact"/>
+              <w:jc w:val="left"/>
+            </w:pPr>
+            <w:r>
+              <w:t xml:space="preserve">9</w:t>
+            </w:r>
+          </w:p>
+        </w:tc>
+        <w:tc>
+          <w:tcPr/>
+          <w:p>
+            <w:pPr>
+              <w:pStyle w:val="Compact"/>
+              <w:jc w:val="left"/>
+            </w:pPr>
+            <w:r>
+              <w:t xml:space="preserve">None received a hearing, in either direction</w:t>
+            </w:r>
+          </w:p>
+        </w:tc>
+      </w:tr>
+      <w:tr>
+        <w:tc>
+          <w:tcPr/>
+          <w:p>
+            <w:pPr>
+              <w:pStyle w:val="Compact"/>
+              <w:jc w:val="left"/>
+            </w:pPr>
+            <w:r>
+              <w:t xml:space="preserve">Direct democracy (recall, initiative)</w:t>
+            </w:r>
+          </w:p>
+        </w:tc>
+        <w:tc>
+          <w:tcPr/>
+          <w:p>
+            <w:pPr>
+              <w:pStyle w:val="Compact"/>
+              <w:jc w:val="left"/>
+            </w:pPr>
+            <w:r>
+              <w:t xml:space="preserve">3</w:t>
+            </w:r>
+          </w:p>
+        </w:tc>
+        <w:tc>
+          <w:tcPr/>
+          <w:p>
+            <w:pPr>
+              <w:pStyle w:val="Compact"/>
+              <w:jc w:val="left"/>
+            </w:pPr>
+            <w:r>
+              <w:t xml:space="preserve">None received a vote</w:t>
+            </w:r>
+          </w:p>
+        </w:tc>
+      </w:tr>
+    </w:tbl>
+    <w:bookmarkEnd w:id="72"/>
+    <w:bookmarkEnd w:id="73"/>
+    <w:bookmarkStart w:id="77" w:name="appendix-i-sources-and-review-notes"/>
+    <w:p>
+      <w:pPr>
+        <w:pStyle w:val="Heading1"/>
+      </w:pPr>
+      <w:r>
+        <w:t xml:space="preserve">Appendix I — Sources and review notes</w:t>
+      </w:r>
+    </w:p>
+    <w:p>
+      <w:pPr>
+        <w:pStyle w:val="FirstParagraph"/>
+      </w:pPr>
+      <w:r>
         <w:t xml:space="preserve">Reviewer-facing material: where every kind of claim in the packet comes</w:t>
       </w:r>
       <w:r>
@@ -38951,7 +39126,7 @@
         <w:t xml:space="preserve">brief by design.</w:t>
       </w:r>
     </w:p>
-    <w:bookmarkStart w:id="77" w:name="claim-to-source-map"/>
+    <w:bookmarkStart w:id="74" w:name="claim-to-source-map"/>
     <w:p>
       <w:pPr>
         <w:pStyle w:val="Heading2"/>
@@ -39338,19 +39513,19 @@
               <w:jc w:val="left"/>
             </w:pPr>
             <w:r>
-              <w:t xml:space="preserve">Citizen proposals and consensus notes ([P-…])</w:t>
-            </w:r>
-          </w:p>
-        </w:tc>
-        <w:tc>
-          <w:tcPr/>
-          <w:p>
-            <w:pPr>
-              <w:pStyle w:val="Compact"/>
-              <w:jc w:val="left"/>
-            </w:pPr>
-            <w:r>
-              <w:t xml:space="preserve">Phase 2 Community Conversations dataset</w:t>
+              <w:t xml:space="preserve">Citizen proposals, frequency, consensus, and concerns ([P-…])</w:t>
+            </w:r>
+          </w:p>
+        </w:tc>
+        <w:tc>
+          <w:tcPr/>
+          <w:p>
+            <w:pPr>
+              <w:pStyle w:val="Compact"/>
+              <w:jc w:val="left"/>
+            </w:pPr>
+            <w:r>
+              <w:t xml:space="preserve">The final Community Conversations proposal grid</w:t>
             </w:r>
             <w:r>
               <w:t xml:space="preserve"> </w:t>
@@ -39359,7 +39534,7 @@
               <w:t xml:space="preserve">“</w:t>
             </w:r>
             <w:r>
-              <w:t xml:space="preserve">SC1 – Phase 2 Constituent Proposals – Grid View for Legislators v2</w:t>
+              <w:t xml:space="preserve">SC1 – Responsive Elected Leaders</w:t>
             </w:r>
             <w:r>
               <w:t xml:space="preserve">”</w:t>
@@ -39368,14 +39543,14 @@
               <w:t xml:space="preserve"> </w:t>
             </w:r>
             <w:r>
-              <w:t xml:space="preserve">via the issue config — process input, not verified fact</w:t>
+              <w:t xml:space="preserve">(received 2026-09-04), reflected in the issue config — process input, not verified fact. It supersedes the earlier Phase 2 v2 grid, which listed six proposals; the four that did not advance are covered as the wider accountability record (see Appendix H’s provenance note)</w:t>
             </w:r>
           </w:p>
         </w:tc>
       </w:tr>
     </w:tbl>
-    <w:bookmarkEnd w:id="77"/>
-    <w:bookmarkStart w:id="78" w:name="collection-and-verification-notes"/>
+    <w:bookmarkEnd w:id="74"/>
+    <w:bookmarkStart w:id="75" w:name="collection-and-verification-notes"/>
     <w:p>
       <w:pPr>
         <w:pStyle w:val="Heading2"/>
@@ -39388,7 +39563,7 @@
       <w:pPr>
         <w:numPr>
           <w:ilvl w:val="0"/>
-          <w:numId w:val="1017"/>
+          <w:numId w:val="1013"/>
         </w:numPr>
         <w:pStyle w:val="Compact"/>
       </w:pPr>
@@ -39424,7 +39599,7 @@
       <w:pPr>
         <w:numPr>
           <w:ilvl w:val="0"/>
-          <w:numId w:val="1017"/>
+          <w:numId w:val="1013"/>
         </w:numPr>
         <w:pStyle w:val="Compact"/>
       </w:pPr>
@@ -39485,7 +39660,7 @@
       <w:pPr>
         <w:numPr>
           <w:ilvl w:val="0"/>
-          <w:numId w:val="1017"/>
+          <w:numId w:val="1013"/>
         </w:numPr>
         <w:pStyle w:val="Compact"/>
       </w:pPr>
@@ -39560,7 +39735,7 @@
       <w:pPr>
         <w:numPr>
           <w:ilvl w:val="0"/>
-          <w:numId w:val="1017"/>
+          <w:numId w:val="1013"/>
         </w:numPr>
         <w:pStyle w:val="Compact"/>
       </w:pPr>
@@ -39599,7 +39774,7 @@
       <w:pPr>
         <w:numPr>
           <w:ilvl w:val="0"/>
-          <w:numId w:val="1017"/>
+          <w:numId w:val="1013"/>
         </w:numPr>
         <w:pStyle w:val="Compact"/>
       </w:pPr>
@@ -39629,7 +39804,7 @@
       <w:pPr>
         <w:numPr>
           <w:ilvl w:val="0"/>
-          <w:numId w:val="1017"/>
+          <w:numId w:val="1013"/>
         </w:numPr>
         <w:pStyle w:val="Compact"/>
       </w:pPr>
@@ -39647,7 +39822,7 @@
       <w:pPr>
         <w:numPr>
           <w:ilvl w:val="0"/>
-          <w:numId w:val="1017"/>
+          <w:numId w:val="1013"/>
         </w:numPr>
         <w:pStyle w:val="Compact"/>
       </w:pPr>
@@ -39665,74 +39840,140 @@
       </w:r>
       <w:r>
         <w:t xml:space="preserve">no counts of other states’ Article V applications).</w:t>
-      </w:r>
-    </w:p>
-    <w:bookmarkEnd w:id="78"/>
-    <w:bookmarkStart w:id="79" w:name="review-status"/>
-    <w:p>
-      <w:pPr>
-        <w:pStyle w:val="Heading2"/>
-      </w:pPr>
-      <w:r>
-        <w:t xml:space="preserve">Review status</w:t>
       </w:r>
     </w:p>
     <w:p>
       <w:pPr>
         <w:numPr>
           <w:ilvl w:val="0"/>
-          <w:numId w:val="1018"/>
+          <w:numId w:val="1013"/>
         </w:numPr>
         <w:pStyle w:val="Compact"/>
       </w:pPr>
       <w:r>
-        <w:t xml:space="preserve">Citizen Reviewer verdict: see</w:t>
+        <w:t xml:space="preserve">Final-grid rework (v2.1, 2026-09-04): the brief, spotlights, and this</w:t>
       </w:r>
       <w:r>
         <w:t xml:space="preserve"> </w:t>
       </w:r>
       <w:r>
-        <w:rPr>
-          <w:rStyle w:val="VerbatimChar"/>
-        </w:rPr>
-        <w:t xml:space="preserve">review-report.md</w:t>
+        <w:t xml:space="preserve">appendix set were reworked around the final two-proposal grid. The</w:t>
       </w:r>
       <w:r>
         <w:t xml:space="preserve"> </w:t>
       </w:r>
       <w:r>
-        <w:t xml:space="preserve">/</w:t>
+        <w:t xml:space="preserve">legislative record — curation, dispositions, and every vote count — is</w:t>
       </w:r>
       <w:r>
         <w:t xml:space="preserve"> </w:t>
       </w:r>
       <w:r>
-        <w:rPr>
-          <w:rStyle w:val="VerbatimChar"/>
-        </w:rPr>
-        <w:t xml:space="preserve">review-report.json</w:t>
+        <w:t xml:space="preserve">unchanged from v2.0; only the framing and proposal crosswalk changed.</w:t>
       </w:r>
       <w:r>
         <w:t xml:space="preserve"> </w:t>
       </w:r>
       <w:r>
-        <w:t xml:space="preserve">in the package root.</w:t>
+        <w:t xml:space="preserve">Commission-design details newly cited in v2.1 (Inspector General</w:t>
+      </w:r>
+      <w:r>
+        <w:t xml:space="preserve"> </w:t>
+      </w:r>
+      <w:r>
+        <w:t xml:space="preserve">applicant panel, nine members, referendum approval; State Ethics</w:t>
+      </w:r>
+      <w:r>
+        <w:t xml:space="preserve"> </w:t>
+      </w:r>
+      <w:r>
+        <w:t xml:space="preserve">Commission appointment, twelve members balanced 5/5/2; no-alteration/</w:t>
+      </w:r>
+      <w:r>
+        <w:t xml:space="preserve"> </w:t>
+      </w:r>
+      <w:r>
+        <w:t xml:space="preserve">no-veto and no-sine-die clauses; decennial appointment cycle; H3547’s</w:t>
+      </w:r>
+      <w:r>
+        <w:t xml:space="preserve"> </w:t>
+      </w:r>
+      <w:r>
+        <w:t xml:space="preserve">State Board curriculum role) were verified against latest-version bill</w:t>
+      </w:r>
+      <w:r>
+        <w:t xml:space="preserve"> </w:t>
+      </w:r>
+      <w:r>
+        <w:t xml:space="preserve">text in the certified universe.</w:t>
+      </w:r>
+    </w:p>
+    <w:bookmarkEnd w:id="75"/>
+    <w:bookmarkStart w:id="76" w:name="review-status"/>
+    <w:p>
+      <w:pPr>
+        <w:pStyle w:val="Heading2"/>
+      </w:pPr>
+      <w:r>
+        <w:t xml:space="preserve">Review status</w:t>
       </w:r>
     </w:p>
     <w:p>
       <w:pPr>
         <w:numPr>
           <w:ilvl w:val="0"/>
-          <w:numId w:val="1018"/>
+          <w:numId w:val="1014"/>
         </w:numPr>
         <w:pStyle w:val="Compact"/>
       </w:pPr>
       <w:r>
+        <w:t xml:space="preserve">Citizen Reviewer verdict: see</w:t>
+      </w:r>
+      <w:r>
+        <w:t xml:space="preserve"> </w:t>
+      </w:r>
+      <w:r>
+        <w:rPr>
+          <w:rStyle w:val="VerbatimChar"/>
+        </w:rPr>
+        <w:t xml:space="preserve">review-report.md</w:t>
+      </w:r>
+      <w:r>
+        <w:t xml:space="preserve"> </w:t>
+      </w:r>
+      <w:r>
+        <w:t xml:space="preserve">/</w:t>
+      </w:r>
+      <w:r>
+        <w:t xml:space="preserve"> </w:t>
+      </w:r>
+      <w:r>
+        <w:rPr>
+          <w:rStyle w:val="VerbatimChar"/>
+        </w:rPr>
+        <w:t xml:space="preserve">review-report.json</w:t>
+      </w:r>
+      <w:r>
+        <w:t xml:space="preserve"> </w:t>
+      </w:r>
+      <w:r>
+        <w:t xml:space="preserve">in the package root.</w:t>
+      </w:r>
+    </w:p>
+    <w:p>
+      <w:pPr>
+        <w:numPr>
+          <w:ilvl w:val="0"/>
+          <w:numId w:val="1014"/>
+        </w:numPr>
+        <w:pStyle w:val="Compact"/>
+      </w:pPr>
+      <w:r>
         <w:t xml:space="preserve">Suggested human reviewers: Ryan Echols, Jodi Stephens, Ashley Lovell.</w:t>
       </w:r>
     </w:p>
-    <w:bookmarkEnd w:id="79"/>
-    <w:bookmarkEnd w:id="80"/>
+    <w:bookmarkEnd w:id="76"/>
+    <w:bookmarkEnd w:id="77"/>
     <w:sectPr/>
   </w:body>
 </w:document>
@@ -40070,18 +40311,6 @@
     <w:abstractNumId w:val="991"/>
   </w:num>
   <w:num w:numId="1014">
-    <w:abstractNumId w:val="991"/>
-  </w:num>
-  <w:num w:numId="1015">
-    <w:abstractNumId w:val="991"/>
-  </w:num>
-  <w:num w:numId="1016">
-    <w:abstractNumId w:val="991"/>
-  </w:num>
-  <w:num w:numId="1017">
-    <w:abstractNumId w:val="991"/>
-  </w:num>
-  <w:num w:numId="1018">
     <w:abstractNumId w:val="991"/>
   </w:num>
 </w:numbering>

</xml_diff>